<commit_message>
Fixes for the handling of the riders and some formatting changes, updated DOCX.
</commit_message>
<xml_diff>
--- a/docassemble/USCISApplications/data/templates/Court_Accompaniment_Intake.docx
+++ b/docassemble/USCISApplications/data/templates/Court_Accompaniment_Intake.docx
@@ -513,7 +513,24 @@
         </w:rPr>
         <w:t xml:space="preserve"> if not </w:t>
       </w:r>
+      <w:proofErr w:type="spellStart"/>
+      <w:r>
+        <w:rPr>
+          <w:rFonts w:ascii="Calibri" w:eastAsia="Calibri" w:hAnsi="Calibri" w:cs="Calibri"/>
+          <w:b/>
+          <w:bCs/>
+        </w:rPr>
+        <w:t>additional_</w:t>
+      </w:r>
       <w:proofErr w:type="gramStart"/>
+      <w:r>
+        <w:rPr>
+          <w:rFonts w:ascii="Calibri" w:eastAsia="Calibri" w:hAnsi="Calibri" w:cs="Calibri"/>
+          <w:b/>
+          <w:bCs/>
+        </w:rPr>
+        <w:t>riders</w:t>
+      </w:r>
       <w:r>
         <w:rPr>
           <w:rFonts w:ascii="Calibri" w:eastAsia="Calibri" w:hAnsi="Calibri" w:cs="Calibri"/>
@@ -522,7 +539,7 @@
           <w:sz w:val="22"/>
           <w:szCs w:val="22"/>
         </w:rPr>
-        <w:t>users[</w:t>
+        <w:t>.there</w:t>
       </w:r>
       <w:proofErr w:type="gramEnd"/>
       <w:r>
@@ -533,18 +550,7 @@
           <w:sz w:val="22"/>
           <w:szCs w:val="22"/>
         </w:rPr>
-        <w:t>0].</w:t>
-      </w:r>
-      <w:proofErr w:type="spellStart"/>
-      <w:r>
-        <w:rPr>
-          <w:rFonts w:ascii="Calibri" w:eastAsia="Calibri" w:hAnsi="Calibri" w:cs="Calibri"/>
-          <w:b/>
-          <w:bCs/>
-          <w:sz w:val="22"/>
-          <w:szCs w:val="22"/>
-        </w:rPr>
-        <w:t>has_riders</w:t>
+        <w:t>_are_any</w:t>
       </w:r>
       <w:proofErr w:type="spellEnd"/>
       <w:r>
@@ -555,7 +561,7 @@
           <w:sz w:val="22"/>
           <w:szCs w:val="22"/>
         </w:rPr>
-        <w:t xml:space="preserve"> %}</w:t>
+        <w:t>%}</w:t>
       </w:r>
     </w:p>
     <w:p>
@@ -650,7 +656,24 @@
         </w:rPr>
         <w:t xml:space="preserve">{%p if </w:t>
       </w:r>
+      <w:proofErr w:type="spellStart"/>
+      <w:r>
+        <w:rPr>
+          <w:rFonts w:ascii="Calibri" w:eastAsia="Calibri" w:hAnsi="Calibri" w:cs="Calibri"/>
+          <w:b/>
+          <w:bCs/>
+        </w:rPr>
+        <w:t>additional_</w:t>
+      </w:r>
       <w:proofErr w:type="gramStart"/>
+      <w:r>
+        <w:rPr>
+          <w:rFonts w:ascii="Calibri" w:eastAsia="Calibri" w:hAnsi="Calibri" w:cs="Calibri"/>
+          <w:b/>
+          <w:bCs/>
+        </w:rPr>
+        <w:t>riders</w:t>
+      </w:r>
       <w:r>
         <w:rPr>
           <w:rFonts w:ascii="Calibri" w:eastAsia="Calibri" w:hAnsi="Calibri" w:cs="Calibri"/>
@@ -659,7 +682,7 @@
           <w:sz w:val="22"/>
           <w:szCs w:val="22"/>
         </w:rPr>
-        <w:t>users[</w:t>
+        <w:t>.there</w:t>
       </w:r>
       <w:proofErr w:type="gramEnd"/>
       <w:r>
@@ -670,18 +693,7 @@
           <w:sz w:val="22"/>
           <w:szCs w:val="22"/>
         </w:rPr>
-        <w:t>0].</w:t>
-      </w:r>
-      <w:proofErr w:type="spellStart"/>
-      <w:r>
-        <w:rPr>
-          <w:rFonts w:ascii="Calibri" w:eastAsia="Calibri" w:hAnsi="Calibri" w:cs="Calibri"/>
-          <w:b/>
-          <w:bCs/>
-          <w:sz w:val="22"/>
-          <w:szCs w:val="22"/>
-        </w:rPr>
-        <w:t>has_riders</w:t>
+        <w:t>_are_any</w:t>
       </w:r>
       <w:proofErr w:type="spellEnd"/>
       <w:r>
@@ -692,7 +704,17 @@
           <w:sz w:val="22"/>
           <w:szCs w:val="22"/>
         </w:rPr>
-        <w:t xml:space="preserve"> %}</w:t>
+        <w:t xml:space="preserve"> </w:t>
+      </w:r>
+      <w:r>
+        <w:rPr>
+          <w:rFonts w:ascii="Calibri" w:eastAsia="Calibri" w:hAnsi="Calibri" w:cs="Calibri"/>
+          <w:b/>
+          <w:bCs/>
+          <w:sz w:val="22"/>
+          <w:szCs w:val="22"/>
+        </w:rPr>
+        <w:t>%}</w:t>
       </w:r>
     </w:p>
     <w:tbl>
@@ -8765,6 +8787,17 @@
 </file>
 
 <file path=customXml/item1.xml><?xml version="1.0" encoding="utf-8"?>
+<p:properties xmlns:p="http://schemas.microsoft.com/office/2006/metadata/properties" xmlns:xsi="http://www.w3.org/2001/XMLSchema-instance" xmlns:pc="http://schemas.microsoft.com/office/infopath/2007/PartnerControls">
+  <documentManagement>
+    <TaxCatchAll xmlns="63cf8f5e-9a9d-4cda-a6f1-06d9c3ed1b56" xsi:nil="true"/>
+    <lcf76f155ced4ddcb4097134ff3c332f xmlns="80f56af5-a235-4a30-ba2c-31a6d000d72b">
+      <Terms xmlns="http://schemas.microsoft.com/office/infopath/2007/PartnerControls"/>
+    </lcf76f155ced4ddcb4097134ff3c332f>
+  </documentManagement>
+</p:properties>
+</file>
+
+<file path=customXml/item2.xml><?xml version="1.0" encoding="utf-8"?>
 <ct:contentTypeSchema xmlns:ct="http://schemas.microsoft.com/office/2006/metadata/contentType" xmlns:ma="http://schemas.microsoft.com/office/2006/metadata/properties/metaAttributes" ct:_="" ma:_="" ma:contentTypeName="Document" ma:contentTypeID="0x0101008F950FA22BD11B439EF2FCEDF7FF0976" ma:contentTypeVersion="12" ma:contentTypeDescription="Create a new document." ma:contentTypeScope="" ma:versionID="38a263841e6eb95b201700ac59630ea1">
   <xsd:schema xmlns:xsd="http://www.w3.org/2001/XMLSchema" xmlns:xs="http://www.w3.org/2001/XMLSchema" xmlns:p="http://schemas.microsoft.com/office/2006/metadata/properties" xmlns:ns2="80f56af5-a235-4a30-ba2c-31a6d000d72b" xmlns:ns3="63cf8f5e-9a9d-4cda-a6f1-06d9c3ed1b56" targetNamespace="http://schemas.microsoft.com/office/2006/metadata/properties" ma:root="true" ma:fieldsID="22a8da6c9b6d44ed7cdad6a9be670acd" ns2:_="" ns3:_="">
     <xsd:import namespace="80f56af5-a235-4a30-ba2c-31a6d000d72b"/>
@@ -8965,17 +8998,6 @@
 </ct:contentTypeSchema>
 </file>
 
-<file path=customXml/item2.xml><?xml version="1.0" encoding="utf-8"?>
-<p:properties xmlns:p="http://schemas.microsoft.com/office/2006/metadata/properties" xmlns:xsi="http://www.w3.org/2001/XMLSchema-instance" xmlns:pc="http://schemas.microsoft.com/office/infopath/2007/PartnerControls">
-  <documentManagement>
-    <TaxCatchAll xmlns="63cf8f5e-9a9d-4cda-a6f1-06d9c3ed1b56" xsi:nil="true"/>
-    <lcf76f155ced4ddcb4097134ff3c332f xmlns="80f56af5-a235-4a30-ba2c-31a6d000d72b">
-      <Terms xmlns="http://schemas.microsoft.com/office/infopath/2007/PartnerControls"/>
-    </lcf76f155ced4ddcb4097134ff3c332f>
-  </documentManagement>
-</p:properties>
-</file>
-
 <file path=customXml/item3.xml><?xml version="1.0" encoding="utf-8"?>
 <?mso-contentType ?>
 <FormTemplates xmlns="http://schemas.microsoft.com/sharepoint/v3/contenttype/forms">
@@ -8986,6 +9008,17 @@
 </file>
 
 <file path=customXml/itemProps1.xml><?xml version="1.0" encoding="utf-8"?>
+<ds:datastoreItem xmlns:ds="http://schemas.openxmlformats.org/officeDocument/2006/customXml" ds:itemID="{8C707276-E6C9-40A6-AF54-110DDA88B001}">
+  <ds:schemaRefs>
+    <ds:schemaRef ds:uri="http://schemas.microsoft.com/office/2006/metadata/properties"/>
+    <ds:schemaRef ds:uri="http://schemas.microsoft.com/office/infopath/2007/PartnerControls"/>
+    <ds:schemaRef ds:uri="63cf8f5e-9a9d-4cda-a6f1-06d9c3ed1b56"/>
+    <ds:schemaRef ds:uri="80f56af5-a235-4a30-ba2c-31a6d000d72b"/>
+  </ds:schemaRefs>
+</ds:datastoreItem>
+</file>
+
+<file path=customXml/itemProps2.xml><?xml version="1.0" encoding="utf-8"?>
 <ds:datastoreItem xmlns:ds="http://schemas.openxmlformats.org/officeDocument/2006/customXml" ds:itemID="{C2CE9F26-E80A-48F8-9E72-0BA6AFEE532E}">
   <ds:schemaRefs>
     <ds:schemaRef ds:uri="http://schemas.microsoft.com/office/2006/metadata/contentType"/>
@@ -9004,17 +9037,6 @@
 </ds:datastoreItem>
 </file>
 
-<file path=customXml/itemProps2.xml><?xml version="1.0" encoding="utf-8"?>
-<ds:datastoreItem xmlns:ds="http://schemas.openxmlformats.org/officeDocument/2006/customXml" ds:itemID="{8C707276-E6C9-40A6-AF54-110DDA88B001}">
-  <ds:schemaRefs>
-    <ds:schemaRef ds:uri="http://schemas.microsoft.com/office/2006/metadata/properties"/>
-    <ds:schemaRef ds:uri="http://schemas.microsoft.com/office/infopath/2007/PartnerControls"/>
-    <ds:schemaRef ds:uri="63cf8f5e-9a9d-4cda-a6f1-06d9c3ed1b56"/>
-    <ds:schemaRef ds:uri="80f56af5-a235-4a30-ba2c-31a6d000d72b"/>
-  </ds:schemaRefs>
-</ds:datastoreItem>
-</file>
-
 <file path=customXml/itemProps3.xml><?xml version="1.0" encoding="utf-8"?>
 <ds:datastoreItem xmlns:ds="http://schemas.openxmlformats.org/officeDocument/2006/customXml" ds:itemID="{B3360DED-8045-43BC-A3F1-77FB7861BCDC}">
   <ds:schemaRefs>

</xml_diff>